<commit_message>
Fixed post-fire events, fixed animation switching
</commit_message>
<xml_diff>
--- a/FPS Framework Guide.docx
+++ b/FPS Framework Guide.docx
@@ -541,6 +541,15 @@
     </w:sdt>
     <w:sdt>
       <w:sdtPr>
+        <w:rPr>
+          <w:rFonts w:asciiTheme="minorHAnsi" w:eastAsiaTheme="minorHAnsi" w:hAnsiTheme="minorHAnsi" w:cstheme="minorBidi"/>
+          <w:color w:val="auto"/>
+          <w:kern w:val="2"/>
+          <w:sz w:val="24"/>
+          <w:szCs w:val="24"/>
+          <w:lang w:eastAsia="en-US"/>
+          <w14:ligatures w14:val="standardContextual"/>
+        </w:rPr>
         <w:id w:val="362488707"/>
         <w:docPartObj>
           <w:docPartGallery w:val="Table of Contents"/>
@@ -549,15 +558,8 @@
       </w:sdtPr>
       <w:sdtEndPr>
         <w:rPr>
-          <w:rFonts w:asciiTheme="minorHAnsi" w:eastAsiaTheme="minorHAnsi" w:hAnsiTheme="minorHAnsi" w:cstheme="minorBidi"/>
           <w:b/>
           <w:bCs/>
-          <w:color w:val="auto"/>
-          <w:kern w:val="2"/>
-          <w:sz w:val="24"/>
-          <w:szCs w:val="24"/>
-          <w:lang w:eastAsia="en-US"/>
-          <w14:ligatures w14:val="standardContextual"/>
         </w:rPr>
       </w:sdtEndPr>
       <w:sdtContent>
@@ -576,7 +578,9 @@
               <w:tab w:val="right" w:leader="dot" w:pos="9016"/>
             </w:tabs>
             <w:rPr>
+              <w:rFonts w:eastAsiaTheme="minorEastAsia"/>
               <w:noProof/>
+              <w:lang w:eastAsia="en-GB"/>
             </w:rPr>
           </w:pPr>
           <w:r>
@@ -588,7 +592,7 @@
           <w:r>
             <w:fldChar w:fldCharType="separate"/>
           </w:r>
-          <w:hyperlink w:anchor="_Toc199710370" w:history="1">
+          <w:hyperlink w:anchor="_Toc199790231" w:history="1">
             <w:r>
               <w:rPr>
                 <w:rStyle w:val="Hyperlink"/>
@@ -615,7 +619,7 @@
                 <w:noProof/>
                 <w:webHidden/>
               </w:rPr>
-              <w:instrText xml:space="preserve"> PAGEREF _Toc199710370 \h </w:instrText>
+              <w:instrText xml:space="preserve"> PAGEREF _Toc199790231 \h </w:instrText>
             </w:r>
             <w:r>
               <w:rPr>
@@ -635,7 +639,211 @@
                 <w:noProof/>
                 <w:webHidden/>
               </w:rPr>
-              <w:t>1</w:t>
+              <w:t>2</w:t>
+            </w:r>
+            <w:r>
+              <w:rPr>
+                <w:noProof/>
+                <w:webHidden/>
+              </w:rPr>
+              <w:fldChar w:fldCharType="end"/>
+            </w:r>
+          </w:hyperlink>
+        </w:p>
+        <w:p>
+          <w:pPr>
+            <w:pStyle w:val="TOC2"/>
+            <w:tabs>
+              <w:tab w:val="right" w:leader="dot" w:pos="9016"/>
+            </w:tabs>
+            <w:rPr>
+              <w:noProof/>
+            </w:rPr>
+          </w:pPr>
+          <w:hyperlink w:anchor="_Toc199790232" w:history="1">
+            <w:r>
+              <w:rPr>
+                <w:rStyle w:val="Hyperlink"/>
+                <w:noProof/>
+              </w:rPr>
+              <w:t>Character Setup</w:t>
+            </w:r>
+            <w:r>
+              <w:rPr>
+                <w:noProof/>
+                <w:webHidden/>
+              </w:rPr>
+              <w:tab/>
+            </w:r>
+            <w:r>
+              <w:rPr>
+                <w:noProof/>
+                <w:webHidden/>
+              </w:rPr>
+              <w:fldChar w:fldCharType="begin"/>
+            </w:r>
+            <w:r>
+              <w:rPr>
+                <w:noProof/>
+                <w:webHidden/>
+              </w:rPr>
+              <w:instrText xml:space="preserve"> PAGEREF _Toc199790232 \h </w:instrText>
+            </w:r>
+            <w:r>
+              <w:rPr>
+                <w:noProof/>
+                <w:webHidden/>
+              </w:rPr>
+            </w:r>
+            <w:r>
+              <w:rPr>
+                <w:noProof/>
+                <w:webHidden/>
+              </w:rPr>
+              <w:fldChar w:fldCharType="separate"/>
+            </w:r>
+            <w:r>
+              <w:rPr>
+                <w:noProof/>
+                <w:webHidden/>
+              </w:rPr>
+              <w:t>2</w:t>
+            </w:r>
+            <w:r>
+              <w:rPr>
+                <w:noProof/>
+                <w:webHidden/>
+              </w:rPr>
+              <w:fldChar w:fldCharType="end"/>
+            </w:r>
+          </w:hyperlink>
+        </w:p>
+        <w:p>
+          <w:pPr>
+            <w:pStyle w:val="TOC3"/>
+            <w:tabs>
+              <w:tab w:val="right" w:leader="dot" w:pos="9016"/>
+            </w:tabs>
+            <w:rPr>
+              <w:noProof/>
+            </w:rPr>
+          </w:pPr>
+          <w:hyperlink w:anchor="_Toc199790233" w:history="1">
+            <w:r>
+              <w:rPr>
+                <w:rStyle w:val="Hyperlink"/>
+                <w:noProof/>
+              </w:rPr>
+              <w:t>Player Entity</w:t>
+            </w:r>
+            <w:r>
+              <w:rPr>
+                <w:noProof/>
+                <w:webHidden/>
+              </w:rPr>
+              <w:tab/>
+            </w:r>
+            <w:r>
+              <w:rPr>
+                <w:noProof/>
+                <w:webHidden/>
+              </w:rPr>
+              <w:fldChar w:fldCharType="begin"/>
+            </w:r>
+            <w:r>
+              <w:rPr>
+                <w:noProof/>
+                <w:webHidden/>
+              </w:rPr>
+              <w:instrText xml:space="preserve"> PAGEREF _Toc199790233 \h </w:instrText>
+            </w:r>
+            <w:r>
+              <w:rPr>
+                <w:noProof/>
+                <w:webHidden/>
+              </w:rPr>
+            </w:r>
+            <w:r>
+              <w:rPr>
+                <w:noProof/>
+                <w:webHidden/>
+              </w:rPr>
+              <w:fldChar w:fldCharType="separate"/>
+            </w:r>
+            <w:r>
+              <w:rPr>
+                <w:noProof/>
+                <w:webHidden/>
+              </w:rPr>
+              <w:t>2</w:t>
+            </w:r>
+            <w:r>
+              <w:rPr>
+                <w:noProof/>
+                <w:webHidden/>
+              </w:rPr>
+              <w:fldChar w:fldCharType="end"/>
+            </w:r>
+          </w:hyperlink>
+        </w:p>
+        <w:p>
+          <w:pPr>
+            <w:pStyle w:val="TOC3"/>
+            <w:tabs>
+              <w:tab w:val="right" w:leader="dot" w:pos="9016"/>
+            </w:tabs>
+            <w:rPr>
+              <w:noProof/>
+            </w:rPr>
+          </w:pPr>
+          <w:hyperlink w:anchor="_Toc199790234" w:history="1">
+            <w:r>
+              <w:rPr>
+                <w:rStyle w:val="Hyperlink"/>
+                <w:noProof/>
+              </w:rPr>
+              <w:t>Player Motor</w:t>
+            </w:r>
+            <w:r>
+              <w:rPr>
+                <w:noProof/>
+                <w:webHidden/>
+              </w:rPr>
+              <w:tab/>
+            </w:r>
+            <w:r>
+              <w:rPr>
+                <w:noProof/>
+                <w:webHidden/>
+              </w:rPr>
+              <w:fldChar w:fldCharType="begin"/>
+            </w:r>
+            <w:r>
+              <w:rPr>
+                <w:noProof/>
+                <w:webHidden/>
+              </w:rPr>
+              <w:instrText xml:space="preserve"> PAGEREF _Toc199790234 \h </w:instrText>
+            </w:r>
+            <w:r>
+              <w:rPr>
+                <w:noProof/>
+                <w:webHidden/>
+              </w:rPr>
+            </w:r>
+            <w:r>
+              <w:rPr>
+                <w:noProof/>
+                <w:webHidden/>
+              </w:rPr>
+              <w:fldChar w:fldCharType="separate"/>
+            </w:r>
+            <w:r>
+              <w:rPr>
+                <w:noProof/>
+                <w:webHidden/>
+              </w:rPr>
+              <w:t>2</w:t>
             </w:r>
             <w:r>
               <w:rPr>
@@ -653,10 +861,12 @@
               <w:tab w:val="right" w:leader="dot" w:pos="9016"/>
             </w:tabs>
             <w:rPr>
+              <w:rFonts w:eastAsiaTheme="minorEastAsia"/>
               <w:noProof/>
+              <w:lang w:eastAsia="en-GB"/>
             </w:rPr>
           </w:pPr>
-          <w:hyperlink w:anchor="_Toc199710371" w:history="1">
+          <w:hyperlink w:anchor="_Toc199790235" w:history="1">
             <w:r>
               <w:rPr>
                 <w:rStyle w:val="Hyperlink"/>
@@ -683,7 +893,7 @@
                 <w:noProof/>
                 <w:webHidden/>
               </w:rPr>
-              <w:instrText xml:space="preserve"> PAGEREF _Toc199710371 \h </w:instrText>
+              <w:instrText xml:space="preserve"> PAGEREF _Toc199790235 \h </w:instrText>
             </w:r>
             <w:r>
               <w:rPr>
@@ -703,7 +913,7 @@
                 <w:noProof/>
                 <w:webHidden/>
               </w:rPr>
-              <w:t>1</w:t>
+              <w:t>3</w:t>
             </w:r>
             <w:r>
               <w:rPr>
@@ -721,10 +931,12 @@
               <w:tab w:val="right" w:leader="dot" w:pos="9016"/>
             </w:tabs>
             <w:rPr>
+              <w:rFonts w:eastAsiaTheme="minorEastAsia"/>
               <w:noProof/>
+              <w:lang w:eastAsia="en-GB"/>
             </w:rPr>
           </w:pPr>
-          <w:hyperlink w:anchor="_Toc199710372" w:history="1">
+          <w:hyperlink w:anchor="_Toc199790236" w:history="1">
             <w:r>
               <w:rPr>
                 <w:rStyle w:val="Hyperlink"/>
@@ -751,7 +963,7 @@
                 <w:noProof/>
                 <w:webHidden/>
               </w:rPr>
-              <w:instrText xml:space="preserve"> PAGEREF _Toc199710372 \h </w:instrText>
+              <w:instrText xml:space="preserve"> PAGEREF _Toc199790236 \h </w:instrText>
             </w:r>
             <w:r>
               <w:rPr>
@@ -771,7 +983,7 @@
                 <w:noProof/>
                 <w:webHidden/>
               </w:rPr>
-              <w:t>1</w:t>
+              <w:t>3</w:t>
             </w:r>
             <w:r>
               <w:rPr>
@@ -802,7 +1014,6 @@
           <w:szCs w:val="40"/>
         </w:rPr>
       </w:pPr>
-      <w:bookmarkStart w:id="0" w:name="_Toc199710370"/>
       <w:r>
         <w:br w:type="page"/>
       </w:r>
@@ -811,6 +1022,7 @@
       <w:pPr>
         <w:pStyle w:val="Heading1"/>
       </w:pPr>
+      <w:bookmarkStart w:id="0" w:name="_Toc199790231"/>
       <w:r>
         <w:lastRenderedPageBreak/>
         <w:t>Setup Guide</w:t>
@@ -821,9 +1033,11 @@
       <w:pPr>
         <w:pStyle w:val="Heading2"/>
       </w:pPr>
+      <w:bookmarkStart w:id="1" w:name="_Toc199790232"/>
       <w:r>
         <w:t>Character Setup</w:t>
       </w:r>
+      <w:bookmarkEnd w:id="1"/>
     </w:p>
     <w:p>
       <w:r>
@@ -849,9 +1063,11 @@
       <w:pPr>
         <w:pStyle w:val="Heading3"/>
       </w:pPr>
+      <w:bookmarkStart w:id="2" w:name="_Toc199790233"/>
       <w:r>
         <w:t>Player Entity</w:t>
       </w:r>
+      <w:bookmarkEnd w:id="2"/>
     </w:p>
     <w:p>
       <w:r>
@@ -875,7 +1091,15 @@
     </w:p>
     <w:p>
       <w:r>
-        <w:t>The entity also has a reference to its viewmodel camera and some other components on it that MUST be assigned.</w:t>
+        <w:t xml:space="preserve">The entity also has a reference to its </w:t>
+      </w:r>
+      <w:proofErr w:type="spellStart"/>
+      <w:r>
+        <w:t>viewmodel</w:t>
+      </w:r>
+      <w:proofErr w:type="spellEnd"/>
+      <w:r>
+        <w:t xml:space="preserve"> camera and some other components on it that MUST be assigned.</w:t>
       </w:r>
     </w:p>
     <w:p>
@@ -905,9 +1129,11 @@
       <w:pPr>
         <w:pStyle w:val="Heading3"/>
       </w:pPr>
+      <w:bookmarkStart w:id="3" w:name="_Toc199790234"/>
       <w:r>
         <w:t>Player Motor</w:t>
       </w:r>
+      <w:bookmarkEnd w:id="3"/>
     </w:p>
     <w:p>
       <w:r>
@@ -919,22 +1145,22 @@
       <w:pPr>
         <w:pStyle w:val="Heading1"/>
       </w:pPr>
-      <w:bookmarkStart w:id="1" w:name="_Toc199710371"/>
+      <w:bookmarkStart w:id="4" w:name="_Toc199790235"/>
       <w:r>
         <w:lastRenderedPageBreak/>
         <w:t>Parameter Reference</w:t>
       </w:r>
-      <w:bookmarkEnd w:id="1"/>
+      <w:bookmarkEnd w:id="4"/>
     </w:p>
     <w:p>
       <w:pPr>
         <w:pStyle w:val="Heading1"/>
       </w:pPr>
-      <w:bookmarkStart w:id="2" w:name="_Toc199710372"/>
+      <w:bookmarkStart w:id="5" w:name="_Toc199790236"/>
       <w:r>
         <w:t>Script Extension Guide</w:t>
       </w:r>
-      <w:bookmarkEnd w:id="2"/>
+      <w:bookmarkEnd w:id="5"/>
     </w:p>
     <w:p/>
     <w:sectPr>
@@ -1942,6 +2168,32 @@
       <w:u w:val="single"/>
     </w:rPr>
   </w:style>
+  <w:style w:type="paragraph" w:styleId="TOC2">
+    <w:name w:val="toc 2"/>
+    <w:basedOn w:val="Normal"/>
+    <w:next w:val="Normal"/>
+    <w:autoRedefine/>
+    <w:uiPriority w:val="39"/>
+    <w:unhideWhenUsed/>
+    <w:rsid w:val="00271466"/>
+    <w:pPr>
+      <w:spacing w:after="100"/>
+      <w:ind w:left="240"/>
+    </w:pPr>
+  </w:style>
+  <w:style w:type="paragraph" w:styleId="TOC3">
+    <w:name w:val="toc 3"/>
+    <w:basedOn w:val="Normal"/>
+    <w:next w:val="Normal"/>
+    <w:autoRedefine/>
+    <w:uiPriority w:val="39"/>
+    <w:unhideWhenUsed/>
+    <w:rsid w:val="00271466"/>
+    <w:pPr>
+      <w:spacing w:after="100"/>
+      <w:ind w:left="480"/>
+    </w:pPr>
+  </w:style>
 </w:styles>
 </file>
 

</xml_diff>